<commit_message>
feat: product detail, cart, checkout, chat, delivery map, manager pages + OTP redirect fix
</commit_message>
<xml_diff>
--- a/PRM393_GroupProject.docx
+++ b/PRM393_GroupProject.docx
@@ -36,12 +36,6 @@
             <w:insideH w:val="single" w:color="auto" w:sz="4" w:space="0"/>
             <w:insideV w:val="single" w:color="auto" w:sz="4" w:space="0"/>
           </w:tblBorders>
-          <w:tblCellMar>
-            <w:top w:w="0" w:type="dxa"/>
-            <w:left w:w="108" w:type="dxa"/>
-            <w:bottom w:w="0" w:type="dxa"/>
-            <w:right w:w="108" w:type="dxa"/>
-          </w:tblCellMar>
         </w:tblPrEx>
         <w:tc>
           <w:tcPr>
@@ -3188,7 +3182,7 @@
           <w:szCs w:val="26"/>
           <w:lang w:val="en-US"/>
         </w:rPr>
-        <w:t xml:space="preserve"> (mail gửi mã otp …)</w:t>
+        <w:t xml:space="preserve"> (tk +mk , có bật mail gửi mã otp …)</w:t>
       </w:r>
     </w:p>
     <w:p>
@@ -3353,6 +3347,7 @@
     <w:p>
       <w:pPr>
         <w:numPr>
+          <w:ilvl w:val="0"/>
           <w:numId w:val="0"/>
         </w:numPr>
         <w:spacing w:after="0"/>
@@ -3377,6 +3372,7 @@
     <w:p>
       <w:pPr>
         <w:numPr>
+          <w:ilvl w:val="0"/>
           <w:numId w:val="0"/>
         </w:numPr>
         <w:spacing w:after="0"/>
@@ -3401,6 +3397,7 @@
     <w:p>
       <w:pPr>
         <w:numPr>
+          <w:ilvl w:val="0"/>
           <w:numId w:val="0"/>
         </w:numPr>
         <w:spacing w:after="0"/>
@@ -3425,6 +3422,7 @@
     <w:p>
       <w:pPr>
         <w:numPr>
+          <w:ilvl w:val="0"/>
           <w:numId w:val="0"/>
         </w:numPr>
         <w:spacing w:after="0"/>
@@ -3501,6 +3499,7 @@
     <w:p>
       <w:pPr>
         <w:numPr>
+          <w:ilvl w:val="0"/>
           <w:numId w:val="0"/>
         </w:numPr>
         <w:spacing w:after="0"/>
@@ -3519,12 +3518,13 @@
           <w:szCs w:val="26"/>
           <w:lang w:val="en-US"/>
         </w:rPr>
-        <w:t>+Ít nhất 2 role : phải code manager và customer.</w:t>
+        <w:t>+Ít nhất 2 role : phải code admin, manager và customer.</w:t>
       </w:r>
     </w:p>
     <w:p>
       <w:pPr>
         <w:numPr>
+          <w:ilvl w:val="0"/>
           <w:numId w:val="0"/>
         </w:numPr>
         <w:spacing w:after="0"/>
@@ -3545,36 +3545,38 @@
         </w:rPr>
         <w:t>+có thể làm BE hoặc gọi api từ bên thứ 3( nếu làm bên thứ 3 thì phải có thêm 1 role liên quan tới bên đó để quản trị)</w:t>
       </w:r>
+    </w:p>
+    <w:p>
+      <w:pPr>
+        <w:numPr>
+          <w:ilvl w:val="0"/>
+          <w:numId w:val="0"/>
+        </w:numPr>
+        <w:spacing w:after="0"/>
+        <w:ind w:left="360" w:leftChars="0"/>
+        <w:rPr>
+          <w:rFonts w:hint="default" w:ascii="Times New Roman" w:hAnsi="Times New Roman" w:cs="Times New Roman"/>
+          <w:sz w:val="26"/>
+          <w:szCs w:val="26"/>
+          <w:lang w:val="en-US"/>
+        </w:rPr>
+      </w:pPr>
+      <w:r>
+        <w:rPr>
+          <w:rFonts w:hint="default" w:ascii="Times New Roman" w:hAnsi="Times New Roman" w:cs="Times New Roman"/>
+          <w:sz w:val="26"/>
+          <w:szCs w:val="26"/>
+          <w:lang w:val="en-US"/>
+        </w:rPr>
+        <w:t>+ko yêu cầu làm document</w:t>
+      </w:r>
       <w:bookmarkStart w:id="0" w:name="_GoBack"/>
       <w:bookmarkEnd w:id="0"/>
     </w:p>
     <w:p>
       <w:pPr>
         <w:numPr>
-          <w:numId w:val="0"/>
-        </w:numPr>
-        <w:spacing w:after="0"/>
-        <w:ind w:left="360" w:leftChars="0"/>
-        <w:rPr>
-          <w:rFonts w:hint="default" w:ascii="Times New Roman" w:hAnsi="Times New Roman" w:cs="Times New Roman"/>
-          <w:sz w:val="26"/>
-          <w:szCs w:val="26"/>
-          <w:lang w:val="en-US"/>
-        </w:rPr>
-      </w:pPr>
-      <w:r>
-        <w:rPr>
-          <w:rFonts w:hint="default" w:ascii="Times New Roman" w:hAnsi="Times New Roman" w:cs="Times New Roman"/>
-          <w:sz w:val="26"/>
-          <w:szCs w:val="26"/>
-          <w:lang w:val="en-US"/>
-        </w:rPr>
-        <w:t>+ko yêu cầu làm document</w:t>
-      </w:r>
-    </w:p>
-    <w:p>
-      <w:pPr>
-        <w:numPr>
+          <w:ilvl w:val="0"/>
           <w:numId w:val="0"/>
         </w:numPr>
         <w:spacing w:after="0"/>
@@ -4892,7 +4894,7 @@
     <w:lsdException w:uiPriority="99" w:name="HTML Sample"/>
     <w:lsdException w:uiPriority="99" w:name="HTML Typewriter"/>
     <w:lsdException w:uiPriority="99" w:name="HTML Variable"/>
-    <w:lsdException w:uiPriority="99" w:name="Normal Table"/>
+    <w:lsdException w:qFormat="1" w:uiPriority="99" w:name="Normal Table"/>
     <w:lsdException w:uiPriority="99" w:name="annotation subject"/>
     <w:lsdException w:uiPriority="99" w:name="Table Simple 1"/>
     <w:lsdException w:uiPriority="99" w:name="Table Simple 2"/>
@@ -4937,7 +4939,7 @@
     <w:lsdException w:uiPriority="99" w:name="Table Web 2"/>
     <w:lsdException w:uiPriority="99" w:name="Table Web 3"/>
     <w:lsdException w:uiPriority="99" w:name="Balloon Text"/>
-    <w:lsdException w:unhideWhenUsed="0" w:uiPriority="39" w:semiHidden="0" w:name="Table Grid"/>
+    <w:lsdException w:qFormat="1" w:unhideWhenUsed="0" w:uiPriority="39" w:semiHidden="0" w:name="Table Grid"/>
     <w:lsdException w:uiPriority="99" w:name="Table Theme"/>
     <w:lsdException w:unhideWhenUsed="0" w:uiPriority="60" w:semiHidden="0" w:name="Light Shading"/>
     <w:lsdException w:unhideWhenUsed="0" w:uiPriority="61" w:semiHidden="0" w:name="Light List"/>
@@ -5290,6 +5292,7 @@
     <w:name w:val="Normal Table"/>
     <w:semiHidden/>
     <w:unhideWhenUsed/>
+    <w:qFormat/>
     <w:uiPriority w:val="99"/>
     <w:tblPr>
       <w:tblCellMar>
@@ -5329,6 +5332,7 @@
   <w:style w:type="table" w:styleId="14">
     <w:name w:val="Table Grid"/>
     <w:basedOn w:val="12"/>
+    <w:qFormat/>
     <w:uiPriority w:val="39"/>
     <w:pPr>
       <w:spacing w:after="0" w:line="240" w:lineRule="auto"/>
@@ -5423,6 +5427,7 @@
     <w:basedOn w:val="11"/>
     <w:link w:val="6"/>
     <w:semiHidden/>
+    <w:qFormat/>
     <w:uiPriority w:val="9"/>
     <w:rPr>
       <w:rFonts w:eastAsiaTheme="majorEastAsia" w:cstheme="majorBidi"/>
@@ -5456,6 +5461,7 @@
     <w:basedOn w:val="11"/>
     <w:link w:val="8"/>
     <w:semiHidden/>
+    <w:qFormat/>
     <w:uiPriority w:val="9"/>
     <w:rPr>
       <w:rFonts w:eastAsiaTheme="majorEastAsia" w:cstheme="majorBidi"/>
@@ -5516,6 +5522,7 @@
     <w:name w:val="Title Char"/>
     <w:basedOn w:val="11"/>
     <w:link w:val="15"/>
+    <w:qFormat/>
     <w:uiPriority w:val="10"/>
     <w:rPr>
       <w:rFonts w:asciiTheme="majorHAnsi" w:hAnsiTheme="majorHAnsi" w:eastAsiaTheme="majorEastAsia" w:cstheme="majorBidi"/>
@@ -5529,6 +5536,7 @@
     <w:name w:val="Subtitle Char"/>
     <w:basedOn w:val="11"/>
     <w:link w:val="13"/>
+    <w:qFormat/>
     <w:uiPriority w:val="11"/>
     <w:rPr>
       <w:rFonts w:eastAsiaTheme="majorEastAsia" w:cstheme="majorBidi"/>
@@ -5575,6 +5583,7 @@
     <w:name w:val="Quote Char"/>
     <w:basedOn w:val="11"/>
     <w:link w:val="27"/>
+    <w:qFormat/>
     <w:uiPriority w:val="29"/>
     <w:rPr>
       <w:i/>
@@ -5637,6 +5646,7 @@
     <w:name w:val="Intense Quote Char"/>
     <w:basedOn w:val="11"/>
     <w:link w:val="31"/>
+    <w:qFormat/>
     <w:uiPriority w:val="30"/>
     <w:rPr>
       <w:i/>

</xml_diff>